<commit_message>
Sprint 6.5 Refactorizacion del backend
</commit_message>
<xml_diff>
--- a/docs/bitacora/Bitacora_completa ES.docx
+++ b/docs/bitacora/Bitacora_completa ES.docx
@@ -37,8 +37,17 @@
           <w:b/>
           <w:bCs/>
         </w:rPr>
-        <w:t>TECHNOTON — FitFlow</w:t>
-      </w:r>
+        <w:t xml:space="preserve">TECHNOTON — </w:t>
+      </w:r>
+      <w:proofErr w:type="spellStart"/>
+      <w:r>
+        <w:rPr>
+          <w:b/>
+          <w:bCs/>
+        </w:rPr>
+        <w:t>FitFlow</w:t>
+      </w:r>
+      <w:proofErr w:type="spellEnd"/>
     </w:p>
     <w:p>
       <w:pPr>
@@ -64,6 +73,7 @@
           <w:bCs/>
         </w:rPr>
       </w:pPr>
+      <w:proofErr w:type="spellStart"/>
       <w:r>
         <w:rPr>
           <w:b/>
@@ -71,7 +81,37 @@
           <w:i/>
           <w:iCs/>
         </w:rPr>
-        <w:t>Build. Scale. Automate.</w:t>
+        <w:t>Build</w:t>
+      </w:r>
+      <w:proofErr w:type="spellEnd"/>
+      <w:r>
+        <w:rPr>
+          <w:b/>
+          <w:bCs/>
+          <w:i/>
+          <w:iCs/>
+        </w:rPr>
+        <w:t xml:space="preserve">. Scale. </w:t>
+      </w:r>
+      <w:proofErr w:type="spellStart"/>
+      <w:r>
+        <w:rPr>
+          <w:b/>
+          <w:bCs/>
+          <w:i/>
+          <w:iCs/>
+        </w:rPr>
+        <w:t>Automate</w:t>
+      </w:r>
+      <w:proofErr w:type="spellEnd"/>
+      <w:r>
+        <w:rPr>
+          <w:b/>
+          <w:bCs/>
+          <w:i/>
+          <w:iCs/>
+        </w:rPr>
+        <w:t>.</w:t>
       </w:r>
     </w:p>
     <w:p>
@@ -90,12 +130,21 @@
       </w:r>
     </w:p>
     <w:p>
-      <w:r>
-        <w:rPr>
-          <w:b/>
-          <w:bCs/>
-        </w:rPr>
-        <w:t>FitFlow – Sistema de Gestión de Gimnasio</w:t>
+      <w:proofErr w:type="spellStart"/>
+      <w:r>
+        <w:rPr>
+          <w:b/>
+          <w:bCs/>
+        </w:rPr>
+        <w:t>FitFlow</w:t>
+      </w:r>
+      <w:proofErr w:type="spellEnd"/>
+      <w:r>
+        <w:rPr>
+          <w:b/>
+          <w:bCs/>
+        </w:rPr>
+        <w:t xml:space="preserve"> – Sistema de Gestión de Gimnasio</w:t>
       </w:r>
       <w:r>
         <w:t xml:space="preserve"> </w:t>
@@ -128,8 +177,13 @@
         <w:t>Autor:</w:t>
       </w:r>
       <w:r>
-        <w:t xml:space="preserve"> Technoton</w:t>
-      </w:r>
+        <w:t xml:space="preserve"> </w:t>
+      </w:r>
+      <w:proofErr w:type="spellStart"/>
+      <w:r>
+        <w:t>Technoton</w:t>
+      </w:r>
+      <w:proofErr w:type="spellEnd"/>
     </w:p>
     <w:p>
       <w:pPr>
@@ -158,22 +212,54 @@
         <w:t>todas las actividades, decisiones y avances</w:t>
       </w:r>
       <w:r>
-        <w:t xml:space="preserve"> del desarrollo de FitFlow. Sirve para auditorías, onboarding y planificación.</w:t>
-      </w:r>
-    </w:p>
-    <w:p>
-      <w:pPr>
-        <w:rPr>
-          <w:b/>
-          <w:bCs/>
-        </w:rPr>
-      </w:pPr>
-      <w:r>
-        <w:rPr>
-          <w:b/>
-          <w:bCs/>
-        </w:rPr>
-        <w:t>3. Semana 1 — Arquitectura Base y Backend Inicial</w:t>
+        <w:t xml:space="preserve"> del desarrollo de </w:t>
+      </w:r>
+      <w:proofErr w:type="spellStart"/>
+      <w:r>
+        <w:t>FitFlow</w:t>
+      </w:r>
+      <w:proofErr w:type="spellEnd"/>
+      <w:r>
+        <w:t xml:space="preserve">. Sirve para auditorías, </w:t>
+      </w:r>
+      <w:proofErr w:type="spellStart"/>
+      <w:r>
+        <w:t>onboarding</w:t>
+      </w:r>
+      <w:proofErr w:type="spellEnd"/>
+      <w:r>
+        <w:t xml:space="preserve"> y planificación.</w:t>
+      </w:r>
+    </w:p>
+    <w:p>
+      <w:pPr>
+        <w:rPr>
+          <w:b/>
+          <w:bCs/>
+        </w:rPr>
+      </w:pPr>
+      <w:r>
+        <w:rPr>
+          <w:b/>
+          <w:bCs/>
+        </w:rPr>
+        <w:t xml:space="preserve">3. Semana 1 — Arquitectura Base y </w:t>
+      </w:r>
+      <w:proofErr w:type="spellStart"/>
+      <w:r>
+        <w:rPr>
+          <w:b/>
+          <w:bCs/>
+        </w:rPr>
+        <w:t>Backend</w:t>
+      </w:r>
+      <w:proofErr w:type="spellEnd"/>
+      <w:r>
+        <w:rPr>
+          <w:b/>
+          <w:bCs/>
+        </w:rPr>
+        <w:t xml:space="preserve"> Inicial</w:t>
       </w:r>
     </w:p>
     <w:p>
@@ -221,8 +307,13 @@
         </w:numPr>
       </w:pPr>
       <w:r>
-        <w:t>Configuración inicial de FastAPI</w:t>
-      </w:r>
+        <w:t xml:space="preserve">Configuración inicial de </w:t>
+      </w:r>
+      <w:proofErr w:type="spellStart"/>
+      <w:r>
+        <w:t>FastAPI</w:t>
+      </w:r>
+      <w:proofErr w:type="spellEnd"/>
     </w:p>
     <w:p>
       <w:pPr>
@@ -232,8 +323,13 @@
         </w:numPr>
       </w:pPr>
       <w:r>
-        <w:t>Estructura base del backend</w:t>
-      </w:r>
+        <w:t xml:space="preserve">Estructura base del </w:t>
+      </w:r>
+      <w:proofErr w:type="spellStart"/>
+      <w:r>
+        <w:t>backend</w:t>
+      </w:r>
+      <w:proofErr w:type="spellEnd"/>
     </w:p>
     <w:p>
       <w:pPr>
@@ -258,8 +354,21 @@
         </w:numPr>
       </w:pPr>
       <w:r>
-        <w:t>Configuración SQLAlchemy Async</w:t>
-      </w:r>
+        <w:t xml:space="preserve">Configuración </w:t>
+      </w:r>
+      <w:proofErr w:type="spellStart"/>
+      <w:r>
+        <w:t>SQLAlchemy</w:t>
+      </w:r>
+      <w:proofErr w:type="spellEnd"/>
+      <w:r>
+        <w:t xml:space="preserve"> </w:t>
+      </w:r>
+      <w:proofErr w:type="spellStart"/>
+      <w:r>
+        <w:t>Async</w:t>
+      </w:r>
+      <w:proofErr w:type="spellEnd"/>
     </w:p>
     <w:p>
       <w:pPr>
@@ -279,8 +388,13 @@
           <w:numId w:val="2"/>
         </w:numPr>
       </w:pPr>
-      <w:r>
-        <w:t>Alembic configurado</w:t>
+      <w:proofErr w:type="spellStart"/>
+      <w:r>
+        <w:t>Alembic</w:t>
+      </w:r>
+      <w:proofErr w:type="spellEnd"/>
+      <w:r>
+        <w:t xml:space="preserve"> configurado</w:t>
       </w:r>
     </w:p>
     <w:p>
@@ -316,8 +430,13 @@
           <w:numId w:val="3"/>
         </w:numPr>
       </w:pPr>
-      <w:r>
-        <w:t>Endpoints de autenticación</w:t>
+      <w:proofErr w:type="spellStart"/>
+      <w:r>
+        <w:t>Endpoints</w:t>
+      </w:r>
+      <w:proofErr w:type="spellEnd"/>
+      <w:r>
+        <w:t xml:space="preserve"> de autenticación</w:t>
       </w:r>
     </w:p>
     <w:p>
@@ -338,9 +457,11 @@
           <w:numId w:val="3"/>
         </w:numPr>
       </w:pPr>
+      <w:proofErr w:type="spellStart"/>
       <w:r>
         <w:t>AuthService</w:t>
       </w:r>
+      <w:proofErr w:type="spellEnd"/>
     </w:p>
     <w:p>
       <w:pPr>
@@ -413,8 +534,13 @@
         </w:numPr>
       </w:pPr>
       <w:r>
-        <w:t>CRUD de GymClass</w:t>
-      </w:r>
+        <w:t xml:space="preserve">CRUD de </w:t>
+      </w:r>
+      <w:proofErr w:type="spellStart"/>
+      <w:r>
+        <w:t>GymClass</w:t>
+      </w:r>
+      <w:proofErr w:type="spellEnd"/>
     </w:p>
     <w:p>
       <w:pPr>
@@ -424,8 +550,13 @@
         </w:numPr>
       </w:pPr>
       <w:r>
-        <w:t>Documentación OpenAPI</w:t>
-      </w:r>
+        <w:t xml:space="preserve">Documentación </w:t>
+      </w:r>
+      <w:proofErr w:type="spellStart"/>
+      <w:r>
+        <w:t>OpenAPI</w:t>
+      </w:r>
+      <w:proofErr w:type="spellEnd"/>
     </w:p>
     <w:p>
       <w:pPr>
@@ -451,7 +582,23 @@
           <w:b/>
           <w:bCs/>
         </w:rPr>
-        <w:t>4. Semana 2 — Frontend Base y Autenticación</w:t>
+        <w:t xml:space="preserve">4. Semana 2 — </w:t>
+      </w:r>
+      <w:proofErr w:type="spellStart"/>
+      <w:r>
+        <w:rPr>
+          <w:b/>
+          <w:bCs/>
+        </w:rPr>
+        <w:t>Frontend</w:t>
+      </w:r>
+      <w:proofErr w:type="spellEnd"/>
+      <w:r>
+        <w:rPr>
+          <w:b/>
+          <w:bCs/>
+        </w:rPr>
+        <w:t xml:space="preserve"> Base y Autenticación</w:t>
       </w:r>
     </w:p>
     <w:p>
@@ -477,7 +624,15 @@
         </w:numPr>
       </w:pPr>
       <w:r>
-        <w:t>Inicialización React + Vite</w:t>
+        <w:t xml:space="preserve">Inicialización </w:t>
+      </w:r>
+      <w:proofErr w:type="spellStart"/>
+      <w:r>
+        <w:t>React</w:t>
+      </w:r>
+      <w:proofErr w:type="spellEnd"/>
+      <w:r>
+        <w:t xml:space="preserve"> + Vite</w:t>
       </w:r>
     </w:p>
     <w:p>
@@ -487,8 +642,13 @@
           <w:numId w:val="6"/>
         </w:numPr>
       </w:pPr>
-      <w:r>
-        <w:t>Chakra UI</w:t>
+      <w:proofErr w:type="spellStart"/>
+      <w:r>
+        <w:t>Chakra</w:t>
+      </w:r>
+      <w:proofErr w:type="spellEnd"/>
+      <w:r>
+        <w:t xml:space="preserve"> UI</w:t>
       </w:r>
     </w:p>
     <w:p>
@@ -572,9 +732,11 @@
           <w:numId w:val="8"/>
         </w:numPr>
       </w:pPr>
+      <w:proofErr w:type="spellStart"/>
       <w:r>
         <w:t>Dashboard</w:t>
       </w:r>
+      <w:proofErr w:type="spellEnd"/>
     </w:p>
     <w:p>
       <w:pPr>
@@ -594,9 +756,11 @@
           <w:numId w:val="8"/>
         </w:numPr>
       </w:pPr>
+      <w:proofErr w:type="spellStart"/>
       <w:r>
         <w:t>AuthContext</w:t>
       </w:r>
+      <w:proofErr w:type="spellEnd"/>
     </w:p>
     <w:p>
       <w:pPr>
@@ -632,8 +796,13 @@
         </w:numPr>
       </w:pPr>
       <w:r>
-        <w:t>Integración con backend</w:t>
-      </w:r>
+        <w:t xml:space="preserve">Integración con </w:t>
+      </w:r>
+      <w:proofErr w:type="spellStart"/>
+      <w:r>
+        <w:t>backend</w:t>
+      </w:r>
+      <w:proofErr w:type="spellEnd"/>
     </w:p>
     <w:p>
       <w:pPr>
@@ -642,8 +811,13 @@
           <w:numId w:val="9"/>
         </w:numPr>
       </w:pPr>
-      <w:r>
-        <w:t>TanStack Query</w:t>
+      <w:proofErr w:type="spellStart"/>
+      <w:r>
+        <w:t>TanStack</w:t>
+      </w:r>
+      <w:proofErr w:type="spellEnd"/>
+      <w:r>
+        <w:t xml:space="preserve"> Query</w:t>
       </w:r>
     </w:p>
     <w:p>
@@ -743,8 +917,13 @@
         </w:numPr>
       </w:pPr>
       <w:r>
-        <w:t>Integración con schedules</w:t>
-      </w:r>
+        <w:t xml:space="preserve">Integración con </w:t>
+      </w:r>
+      <w:proofErr w:type="spellStart"/>
+      <w:r>
+        <w:t>schedules</w:t>
+      </w:r>
+      <w:proofErr w:type="spellEnd"/>
     </w:p>
     <w:p>
       <w:pPr>
@@ -816,10 +995,20 @@
           <w:numId w:val="13"/>
         </w:numPr>
       </w:pPr>
+      <w:proofErr w:type="spellStart"/>
       <w:r>
         <w:lastRenderedPageBreak/>
-        <w:t>Endpoints de booking</w:t>
-      </w:r>
+        <w:t>Endpoints</w:t>
+      </w:r>
+      <w:proofErr w:type="spellEnd"/>
+      <w:r>
+        <w:t xml:space="preserve"> de </w:t>
+      </w:r>
+      <w:proofErr w:type="spellStart"/>
+      <w:r>
+        <w:t>booking</w:t>
+      </w:r>
+      <w:proofErr w:type="spellEnd"/>
     </w:p>
     <w:p>
       <w:pPr>
@@ -896,8 +1085,33 @@
           <w:b/>
           <w:bCs/>
         </w:rPr>
-        <w:t>6. Semana 4 — Testing, Documentación y Deploy</w:t>
-      </w:r>
+        <w:t xml:space="preserve">6. Semana 4 — </w:t>
+      </w:r>
+      <w:proofErr w:type="spellStart"/>
+      <w:r>
+        <w:rPr>
+          <w:b/>
+          <w:bCs/>
+        </w:rPr>
+        <w:t>Testing</w:t>
+      </w:r>
+      <w:proofErr w:type="spellEnd"/>
+      <w:r>
+        <w:rPr>
+          <w:b/>
+          <w:bCs/>
+        </w:rPr>
+        <w:t xml:space="preserve">, Documentación y </w:t>
+      </w:r>
+      <w:proofErr w:type="spellStart"/>
+      <w:r>
+        <w:rPr>
+          <w:b/>
+          <w:bCs/>
+        </w:rPr>
+        <w:t>Deploy</w:t>
+      </w:r>
+      <w:proofErr w:type="spellEnd"/>
     </w:p>
     <w:p>
       <w:pPr>
@@ -921,9 +1135,19 @@
           <w:numId w:val="16"/>
         </w:numPr>
       </w:pPr>
-      <w:r>
-        <w:t>Tests backend</w:t>
-      </w:r>
+      <w:proofErr w:type="spellStart"/>
+      <w:r>
+        <w:t>Tests</w:t>
+      </w:r>
+      <w:proofErr w:type="spellEnd"/>
+      <w:r>
+        <w:t xml:space="preserve"> </w:t>
+      </w:r>
+      <w:proofErr w:type="spellStart"/>
+      <w:r>
+        <w:t>backend</w:t>
+      </w:r>
+      <w:proofErr w:type="spellEnd"/>
     </w:p>
     <w:p>
       <w:pPr>
@@ -933,8 +1157,13 @@
         </w:numPr>
       </w:pPr>
       <w:r>
-        <w:t>Fixtures async</w:t>
-      </w:r>
+        <w:t xml:space="preserve">Fixtures </w:t>
+      </w:r>
+      <w:proofErr w:type="spellStart"/>
+      <w:r>
+        <w:t>async</w:t>
+      </w:r>
+      <w:proofErr w:type="spellEnd"/>
     </w:p>
     <w:p>
       <w:pPr>
@@ -958,9 +1187,19 @@
           <w:numId w:val="17"/>
         </w:numPr>
       </w:pPr>
-      <w:r>
-        <w:t>Tests de endpoints</w:t>
-      </w:r>
+      <w:proofErr w:type="spellStart"/>
+      <w:r>
+        <w:t>Tests</w:t>
+      </w:r>
+      <w:proofErr w:type="spellEnd"/>
+      <w:r>
+        <w:t xml:space="preserve"> de </w:t>
+      </w:r>
+      <w:proofErr w:type="spellStart"/>
+      <w:r>
+        <w:t>endpoints</w:t>
+      </w:r>
+      <w:proofErr w:type="spellEnd"/>
     </w:p>
     <w:p>
       <w:pPr>
@@ -995,9 +1234,19 @@
           <w:numId w:val="18"/>
         </w:numPr>
       </w:pPr>
-      <w:r>
-        <w:t>Tests frontend</w:t>
-      </w:r>
+      <w:proofErr w:type="spellStart"/>
+      <w:r>
+        <w:t>Tests</w:t>
+      </w:r>
+      <w:proofErr w:type="spellEnd"/>
+      <w:r>
+        <w:t xml:space="preserve"> </w:t>
+      </w:r>
+      <w:proofErr w:type="spellStart"/>
+      <w:r>
+        <w:t>frontend</w:t>
+      </w:r>
+      <w:proofErr w:type="spellEnd"/>
     </w:p>
     <w:p>
       <w:pPr>
@@ -1006,9 +1255,11 @@
           <w:numId w:val="18"/>
         </w:numPr>
       </w:pPr>
+      <w:proofErr w:type="spellStart"/>
       <w:r>
         <w:t>Vitest</w:t>
       </w:r>
+      <w:proofErr w:type="spellEnd"/>
     </w:p>
     <w:p>
       <w:pPr>
@@ -1102,9 +1353,19 @@
           <w:numId w:val="20"/>
         </w:numPr>
       </w:pPr>
-      <w:r>
-        <w:t>Deploy a staging</w:t>
-      </w:r>
+      <w:proofErr w:type="spellStart"/>
+      <w:r>
+        <w:t>Deploy</w:t>
+      </w:r>
+      <w:proofErr w:type="spellEnd"/>
+      <w:r>
+        <w:t xml:space="preserve"> a </w:t>
+      </w:r>
+      <w:proofErr w:type="spellStart"/>
+      <w:r>
+        <w:t>staging</w:t>
+      </w:r>
+      <w:proofErr w:type="spellEnd"/>
     </w:p>
     <w:p>
       <w:pPr>
@@ -1129,8 +1390,13 @@
         </w:numPr>
       </w:pPr>
       <w:r>
-        <w:t>Arquitectura async</w:t>
-      </w:r>
+        <w:t xml:space="preserve">Arquitectura </w:t>
+      </w:r>
+      <w:proofErr w:type="spellStart"/>
+      <w:r>
+        <w:t>async</w:t>
+      </w:r>
+      <w:proofErr w:type="spellEnd"/>
     </w:p>
     <w:p>
       <w:pPr>
@@ -1150,8 +1416,13 @@
           <w:numId w:val="21"/>
         </w:numPr>
       </w:pPr>
-      <w:r>
-        <w:t>TanStack Query</w:t>
+      <w:proofErr w:type="spellStart"/>
+      <w:r>
+        <w:t>TanStack</w:t>
+      </w:r>
+      <w:proofErr w:type="spellEnd"/>
+      <w:r>
+        <w:t xml:space="preserve"> Query</w:t>
       </w:r>
     </w:p>
     <w:p>
@@ -1267,7 +1538,522 @@
         <w:t>La bitácora documenta todo el proceso de desarrollo y es clave para auditorías y planificación.</w:t>
       </w:r>
     </w:p>
-    <w:p/>
+    <w:p>
+      <w:pPr>
+        <w:rPr>
+          <w:b/>
+          <w:bCs/>
+        </w:rPr>
+      </w:pPr>
+      <w:r>
+        <w:rPr>
+          <w:rFonts w:ascii="Segoe UI Emoji" w:hAnsi="Segoe UI Emoji" w:cs="Segoe UI Emoji"/>
+          <w:b/>
+          <w:bCs/>
+        </w:rPr>
+        <w:t>🔹</w:t>
+      </w:r>
+      <w:r>
+        <w:rPr>
+          <w:b/>
+          <w:bCs/>
+        </w:rPr>
+        <w:t xml:space="preserve"> Semana 5 — Cierre Sprint 6 (</w:t>
+      </w:r>
+      <w:proofErr w:type="spellStart"/>
+      <w:r>
+        <w:rPr>
+          <w:b/>
+          <w:bCs/>
+        </w:rPr>
+        <w:t>Backend</w:t>
+      </w:r>
+      <w:proofErr w:type="spellEnd"/>
+      <w:r>
+        <w:rPr>
+          <w:b/>
+          <w:bCs/>
+        </w:rPr>
+        <w:t xml:space="preserve"> completo y operativo)</w:t>
+      </w:r>
+    </w:p>
+    <w:p>
+      <w:r>
+        <w:rPr>
+          <w:b/>
+          <w:bCs/>
+        </w:rPr>
+        <w:t>Día 21</w:t>
+      </w:r>
+    </w:p>
+    <w:p>
+      <w:pPr>
+        <w:numPr>
+          <w:ilvl w:val="0"/>
+          <w:numId w:val="23"/>
+        </w:numPr>
+      </w:pPr>
+      <w:r>
+        <w:t xml:space="preserve">Resolución de conflictos entre </w:t>
+      </w:r>
+      <w:proofErr w:type="spellStart"/>
+      <w:r>
+        <w:t>develop</w:t>
+      </w:r>
+      <w:proofErr w:type="spellEnd"/>
+      <w:r>
+        <w:t xml:space="preserve"> y </w:t>
+      </w:r>
+      <w:proofErr w:type="spellStart"/>
+      <w:r>
+        <w:t>main</w:t>
+      </w:r>
+      <w:proofErr w:type="spellEnd"/>
+    </w:p>
+    <w:p>
+      <w:pPr>
+        <w:numPr>
+          <w:ilvl w:val="0"/>
+          <w:numId w:val="23"/>
+        </w:numPr>
+      </w:pPr>
+      <w:proofErr w:type="spellStart"/>
+      <w:r>
+        <w:t>Merge</w:t>
+      </w:r>
+      <w:proofErr w:type="spellEnd"/>
+      <w:r>
+        <w:t xml:space="preserve"> final y publicación del </w:t>
+      </w:r>
+      <w:proofErr w:type="spellStart"/>
+      <w:r>
+        <w:t>release</w:t>
+      </w:r>
+      <w:proofErr w:type="spellEnd"/>
+      <w:r>
+        <w:t> v0.6.0</w:t>
+      </w:r>
+    </w:p>
+    <w:p>
+      <w:pPr>
+        <w:numPr>
+          <w:ilvl w:val="0"/>
+          <w:numId w:val="23"/>
+        </w:numPr>
+      </w:pPr>
+      <w:r>
+        <w:t xml:space="preserve">Documentación de </w:t>
+      </w:r>
+      <w:proofErr w:type="spellStart"/>
+      <w:r>
+        <w:t>endpoints</w:t>
+      </w:r>
+      <w:proofErr w:type="spellEnd"/>
+      <w:r>
+        <w:t xml:space="preserve"> y roles</w:t>
+      </w:r>
+    </w:p>
+    <w:p>
+      <w:pPr>
+        <w:numPr>
+          <w:ilvl w:val="0"/>
+          <w:numId w:val="23"/>
+        </w:numPr>
+      </w:pPr>
+      <w:r>
+        <w:t xml:space="preserve">Validación de servicios y </w:t>
+      </w:r>
+      <w:proofErr w:type="spellStart"/>
+      <w:r>
+        <w:t>routers</w:t>
+      </w:r>
+      <w:proofErr w:type="spellEnd"/>
+    </w:p>
+    <w:p>
+      <w:r>
+        <w:rPr>
+          <w:b/>
+          <w:bCs/>
+        </w:rPr>
+        <w:t>Día 22</w:t>
+      </w:r>
+    </w:p>
+    <w:p>
+      <w:pPr>
+        <w:numPr>
+          <w:ilvl w:val="0"/>
+          <w:numId w:val="24"/>
+        </w:numPr>
+      </w:pPr>
+      <w:r>
+        <w:t>Revisión de arquitectura modular</w:t>
+      </w:r>
+    </w:p>
+    <w:p>
+      <w:pPr>
+        <w:numPr>
+          <w:ilvl w:val="0"/>
+          <w:numId w:val="24"/>
+        </w:numPr>
+      </w:pPr>
+      <w:r>
+        <w:t xml:space="preserve">Ajustes en dependencias y </w:t>
+      </w:r>
+      <w:proofErr w:type="spellStart"/>
+      <w:r>
+        <w:t>requirements</w:t>
+      </w:r>
+      <w:proofErr w:type="spellEnd"/>
+    </w:p>
+    <w:p>
+      <w:pPr>
+        <w:numPr>
+          <w:ilvl w:val="0"/>
+          <w:numId w:val="24"/>
+        </w:numPr>
+      </w:pPr>
+      <w:r>
+        <w:t>Actualización de README técnico</w:t>
+      </w:r>
+    </w:p>
+    <w:p>
+      <w:pPr>
+        <w:numPr>
+          <w:ilvl w:val="0"/>
+          <w:numId w:val="24"/>
+        </w:numPr>
+      </w:pPr>
+      <w:r>
+        <w:t>Preparación para Sprint 7 (MVP operativo)</w:t>
+      </w:r>
+    </w:p>
+    <w:p>
+      <w:pPr>
+        <w:rPr>
+          <w:b/>
+          <w:bCs/>
+        </w:rPr>
+      </w:pPr>
+      <w:r>
+        <w:rPr>
+          <w:rFonts w:ascii="Segoe UI Emoji" w:hAnsi="Segoe UI Emoji" w:cs="Segoe UI Emoji"/>
+          <w:b/>
+          <w:bCs/>
+        </w:rPr>
+        <w:t>🔹</w:t>
+      </w:r>
+      <w:r>
+        <w:rPr>
+          <w:b/>
+          <w:bCs/>
+        </w:rPr>
+        <w:t xml:space="preserve"> Semana 6 — Inicio Sprint 7 (Integración y MVP operativo)</w:t>
+      </w:r>
+    </w:p>
+    <w:p>
+      <w:r>
+        <w:rPr>
+          <w:b/>
+          <w:bCs/>
+        </w:rPr>
+        <w:t>Día 23</w:t>
+      </w:r>
+    </w:p>
+    <w:p>
+      <w:pPr>
+        <w:numPr>
+          <w:ilvl w:val="0"/>
+          <w:numId w:val="25"/>
+        </w:numPr>
+      </w:pPr>
+      <w:r>
+        <w:t xml:space="preserve">Creación de rama </w:t>
+      </w:r>
+      <w:proofErr w:type="spellStart"/>
+      <w:r>
+        <w:t>feature</w:t>
+      </w:r>
+      <w:proofErr w:type="spellEnd"/>
+      <w:r>
+        <w:t>/sprint-7</w:t>
+      </w:r>
+    </w:p>
+    <w:p>
+      <w:pPr>
+        <w:numPr>
+          <w:ilvl w:val="0"/>
+          <w:numId w:val="25"/>
+        </w:numPr>
+      </w:pPr>
+      <w:r>
+        <w:t>Definición de objetivos del MVP</w:t>
+      </w:r>
+    </w:p>
+    <w:p>
+      <w:pPr>
+        <w:numPr>
+          <w:ilvl w:val="0"/>
+          <w:numId w:val="25"/>
+        </w:numPr>
+      </w:pPr>
+      <w:r>
+        <w:t xml:space="preserve">Planificación de integración </w:t>
+      </w:r>
+      <w:proofErr w:type="spellStart"/>
+      <w:r>
+        <w:t>frontend-backend</w:t>
+      </w:r>
+      <w:proofErr w:type="spellEnd"/>
+    </w:p>
+    <w:p>
+      <w:r>
+        <w:rPr>
+          <w:b/>
+          <w:bCs/>
+        </w:rPr>
+        <w:t>Día 24</w:t>
+      </w:r>
+    </w:p>
+    <w:p>
+      <w:pPr>
+        <w:numPr>
+          <w:ilvl w:val="0"/>
+          <w:numId w:val="26"/>
+        </w:numPr>
+      </w:pPr>
+      <w:r>
+        <w:t xml:space="preserve">Implementación de </w:t>
+      </w:r>
+      <w:proofErr w:type="spellStart"/>
+      <w:r>
+        <w:t>dashboard</w:t>
+      </w:r>
+      <w:proofErr w:type="spellEnd"/>
+      <w:r>
+        <w:t xml:space="preserve"> principal</w:t>
+      </w:r>
+    </w:p>
+    <w:p>
+      <w:pPr>
+        <w:numPr>
+          <w:ilvl w:val="0"/>
+          <w:numId w:val="26"/>
+        </w:numPr>
+      </w:pPr>
+      <w:r>
+        <w:t>Conexión de reservas y sesiones en tiempo real</w:t>
+      </w:r>
+    </w:p>
+    <w:p>
+      <w:pPr>
+        <w:numPr>
+          <w:ilvl w:val="0"/>
+          <w:numId w:val="26"/>
+        </w:numPr>
+      </w:pPr>
+      <w:r>
+        <w:t>Ajustes de autenticación y roles</w:t>
+      </w:r>
+    </w:p>
+    <w:p>
+      <w:r>
+        <w:rPr>
+          <w:b/>
+          <w:bCs/>
+        </w:rPr>
+        <w:t>Día 25</w:t>
+      </w:r>
+    </w:p>
+    <w:p>
+      <w:pPr>
+        <w:numPr>
+          <w:ilvl w:val="0"/>
+          <w:numId w:val="27"/>
+        </w:numPr>
+      </w:pPr>
+      <w:proofErr w:type="spellStart"/>
+      <w:r>
+        <w:t>Testing</w:t>
+      </w:r>
+      <w:proofErr w:type="spellEnd"/>
+      <w:r>
+        <w:t xml:space="preserve"> E2E inicial</w:t>
+      </w:r>
+    </w:p>
+    <w:p>
+      <w:pPr>
+        <w:numPr>
+          <w:ilvl w:val="0"/>
+          <w:numId w:val="27"/>
+        </w:numPr>
+      </w:pPr>
+      <w:r>
+        <w:t>Validación de flujo de usuario</w:t>
+      </w:r>
+    </w:p>
+    <w:p>
+      <w:pPr>
+        <w:numPr>
+          <w:ilvl w:val="0"/>
+          <w:numId w:val="27"/>
+        </w:numPr>
+      </w:pPr>
+      <w:r>
+        <w:t xml:space="preserve">Documentación de </w:t>
+      </w:r>
+      <w:proofErr w:type="spellStart"/>
+      <w:r>
+        <w:t>endpoints</w:t>
+      </w:r>
+      <w:proofErr w:type="spellEnd"/>
+      <w:r>
+        <w:t xml:space="preserve"> críticos</w:t>
+      </w:r>
+    </w:p>
+    <w:p>
+      <w:pPr>
+        <w:rPr>
+          <w:b/>
+          <w:bCs/>
+        </w:rPr>
+      </w:pPr>
+      <w:r>
+        <w:rPr>
+          <w:rFonts w:ascii="Segoe UI Emoji" w:hAnsi="Segoe UI Emoji" w:cs="Segoe UI Emoji"/>
+          <w:b/>
+          <w:bCs/>
+        </w:rPr>
+        <w:lastRenderedPageBreak/>
+        <w:t>🔹</w:t>
+      </w:r>
+      <w:r>
+        <w:rPr>
+          <w:b/>
+          <w:bCs/>
+        </w:rPr>
+        <w:t xml:space="preserve"> Decisiones Técnicas Relevantes</w:t>
+      </w:r>
+    </w:p>
+    <w:p>
+      <w:pPr>
+        <w:numPr>
+          <w:ilvl w:val="0"/>
+          <w:numId w:val="28"/>
+        </w:numPr>
+      </w:pPr>
+      <w:r>
+        <w:t>Consolidación de arquitectura modular</w:t>
+      </w:r>
+    </w:p>
+    <w:p>
+      <w:pPr>
+        <w:numPr>
+          <w:ilvl w:val="0"/>
+          <w:numId w:val="28"/>
+        </w:numPr>
+        <w:rPr>
+          <w:lang w:val="en-US"/>
+        </w:rPr>
+      </w:pPr>
+      <w:r>
+        <w:rPr>
+          <w:lang w:val="en-US"/>
+        </w:rPr>
+        <w:t>Flujo Git profesional (develop → main → release)</w:t>
+      </w:r>
+    </w:p>
+    <w:p>
+      <w:pPr>
+        <w:numPr>
+          <w:ilvl w:val="0"/>
+          <w:numId w:val="28"/>
+        </w:numPr>
+      </w:pPr>
+      <w:r>
+        <w:t>Versionado semántico (v0.6.0 → v0.7.0)</w:t>
+      </w:r>
+    </w:p>
+    <w:p>
+      <w:pPr>
+        <w:numPr>
+          <w:ilvl w:val="0"/>
+          <w:numId w:val="28"/>
+        </w:numPr>
+      </w:pPr>
+      <w:r>
+        <w:t xml:space="preserve">Integración de </w:t>
+      </w:r>
+      <w:proofErr w:type="spellStart"/>
+      <w:r>
+        <w:t>frontend</w:t>
+      </w:r>
+      <w:proofErr w:type="spellEnd"/>
+      <w:r>
+        <w:t xml:space="preserve"> con </w:t>
+      </w:r>
+      <w:proofErr w:type="spellStart"/>
+      <w:r>
+        <w:t>TanStack</w:t>
+      </w:r>
+      <w:proofErr w:type="spellEnd"/>
+      <w:r>
+        <w:t> Query</w:t>
+      </w:r>
+    </w:p>
+    <w:p>
+      <w:pPr>
+        <w:numPr>
+          <w:ilvl w:val="0"/>
+          <w:numId w:val="28"/>
+        </w:numPr>
+      </w:pPr>
+      <w:r>
+        <w:t>Preparación para despliegue MVP</w:t>
+      </w:r>
+    </w:p>
+    <w:p>
+      <w:pPr>
+        <w:rPr>
+          <w:b/>
+          <w:bCs/>
+        </w:rPr>
+      </w:pPr>
+      <w:r>
+        <w:rPr>
+          <w:rFonts w:ascii="Segoe UI Emoji" w:hAnsi="Segoe UI Emoji" w:cs="Segoe UI Emoji"/>
+          <w:b/>
+          <w:bCs/>
+        </w:rPr>
+        <w:t>🔹</w:t>
+      </w:r>
+      <w:r>
+        <w:rPr>
+          <w:b/>
+          <w:bCs/>
+        </w:rPr>
+        <w:t xml:space="preserve"> Conclusión</w:t>
+      </w:r>
+    </w:p>
+    <w:p>
+      <w:r>
+        <w:t xml:space="preserve">El Sprint 6 marca el cierre del </w:t>
+      </w:r>
+      <w:proofErr w:type="spellStart"/>
+      <w:r>
+        <w:t>backend</w:t>
+      </w:r>
+      <w:proofErr w:type="spellEnd"/>
+      <w:r>
+        <w:t xml:space="preserve"> completo y operativo. El Sprint 7 inicia la fase de integración y desarrollo del MVP funcional, con foco en experiencia de usuario y estabilidad del sistema.</w:t>
+      </w:r>
+    </w:p>
+    <w:p>
+      <w:pPr>
+        <w:rPr>
+          <w:u w:val="single"/>
+        </w:rPr>
+      </w:pPr>
+    </w:p>
     <w:sectPr>
       <w:pgSz w:w="11906" w:h="16838"/>
       <w:pgMar w:top="1417" w:right="1701" w:bottom="1417" w:left="1701" w:header="708" w:footer="708" w:gutter="0"/>
@@ -1579,6 +2365,304 @@
     </w:lvl>
   </w:abstractNum>
   <w:abstractNum w:abstractNumId="2" w15:restartNumberingAfterBreak="0">
+    <w:nsid w:val="06FA5B26"/>
+    <w:multiLevelType w:val="multilevel"/>
+    <w:tmpl w:val="1754463C"/>
+    <w:lvl w:ilvl="0">
+      <w:start w:val="1"/>
+      <w:numFmt w:val="bullet"/>
+      <w:lvlText w:val=""/>
+      <w:lvlJc w:val="left"/>
+      <w:pPr>
+        <w:tabs>
+          <w:tab w:val="num" w:pos="720"/>
+        </w:tabs>
+        <w:ind w:left="720" w:hanging="360"/>
+      </w:pPr>
+      <w:rPr>
+        <w:rFonts w:ascii="Symbol" w:hAnsi="Symbol" w:hint="default"/>
+        <w:sz w:val="20"/>
+      </w:rPr>
+    </w:lvl>
+    <w:lvl w:ilvl="1" w:tentative="1">
+      <w:start w:val="1"/>
+      <w:numFmt w:val="bullet"/>
+      <w:lvlText w:val="o"/>
+      <w:lvlJc w:val="left"/>
+      <w:pPr>
+        <w:tabs>
+          <w:tab w:val="num" w:pos="1440"/>
+        </w:tabs>
+        <w:ind w:left="1440" w:hanging="360"/>
+      </w:pPr>
+      <w:rPr>
+        <w:rFonts w:ascii="Courier New" w:hAnsi="Courier New" w:hint="default"/>
+        <w:sz w:val="20"/>
+      </w:rPr>
+    </w:lvl>
+    <w:lvl w:ilvl="2" w:tentative="1">
+      <w:start w:val="1"/>
+      <w:numFmt w:val="bullet"/>
+      <w:lvlText w:val=""/>
+      <w:lvlJc w:val="left"/>
+      <w:pPr>
+        <w:tabs>
+          <w:tab w:val="num" w:pos="2160"/>
+        </w:tabs>
+        <w:ind w:left="2160" w:hanging="360"/>
+      </w:pPr>
+      <w:rPr>
+        <w:rFonts w:ascii="Wingdings" w:hAnsi="Wingdings" w:hint="default"/>
+        <w:sz w:val="20"/>
+      </w:rPr>
+    </w:lvl>
+    <w:lvl w:ilvl="3" w:tentative="1">
+      <w:start w:val="1"/>
+      <w:numFmt w:val="bullet"/>
+      <w:lvlText w:val=""/>
+      <w:lvlJc w:val="left"/>
+      <w:pPr>
+        <w:tabs>
+          <w:tab w:val="num" w:pos="2880"/>
+        </w:tabs>
+        <w:ind w:left="2880" w:hanging="360"/>
+      </w:pPr>
+      <w:rPr>
+        <w:rFonts w:ascii="Wingdings" w:hAnsi="Wingdings" w:hint="default"/>
+        <w:sz w:val="20"/>
+      </w:rPr>
+    </w:lvl>
+    <w:lvl w:ilvl="4" w:tentative="1">
+      <w:start w:val="1"/>
+      <w:numFmt w:val="bullet"/>
+      <w:lvlText w:val=""/>
+      <w:lvlJc w:val="left"/>
+      <w:pPr>
+        <w:tabs>
+          <w:tab w:val="num" w:pos="3600"/>
+        </w:tabs>
+        <w:ind w:left="3600" w:hanging="360"/>
+      </w:pPr>
+      <w:rPr>
+        <w:rFonts w:ascii="Wingdings" w:hAnsi="Wingdings" w:hint="default"/>
+        <w:sz w:val="20"/>
+      </w:rPr>
+    </w:lvl>
+    <w:lvl w:ilvl="5" w:tentative="1">
+      <w:start w:val="1"/>
+      <w:numFmt w:val="bullet"/>
+      <w:lvlText w:val=""/>
+      <w:lvlJc w:val="left"/>
+      <w:pPr>
+        <w:tabs>
+          <w:tab w:val="num" w:pos="4320"/>
+        </w:tabs>
+        <w:ind w:left="4320" w:hanging="360"/>
+      </w:pPr>
+      <w:rPr>
+        <w:rFonts w:ascii="Wingdings" w:hAnsi="Wingdings" w:hint="default"/>
+        <w:sz w:val="20"/>
+      </w:rPr>
+    </w:lvl>
+    <w:lvl w:ilvl="6" w:tentative="1">
+      <w:start w:val="1"/>
+      <w:numFmt w:val="bullet"/>
+      <w:lvlText w:val=""/>
+      <w:lvlJc w:val="left"/>
+      <w:pPr>
+        <w:tabs>
+          <w:tab w:val="num" w:pos="5040"/>
+        </w:tabs>
+        <w:ind w:left="5040" w:hanging="360"/>
+      </w:pPr>
+      <w:rPr>
+        <w:rFonts w:ascii="Wingdings" w:hAnsi="Wingdings" w:hint="default"/>
+        <w:sz w:val="20"/>
+      </w:rPr>
+    </w:lvl>
+    <w:lvl w:ilvl="7" w:tentative="1">
+      <w:start w:val="1"/>
+      <w:numFmt w:val="bullet"/>
+      <w:lvlText w:val=""/>
+      <w:lvlJc w:val="left"/>
+      <w:pPr>
+        <w:tabs>
+          <w:tab w:val="num" w:pos="5760"/>
+        </w:tabs>
+        <w:ind w:left="5760" w:hanging="360"/>
+      </w:pPr>
+      <w:rPr>
+        <w:rFonts w:ascii="Wingdings" w:hAnsi="Wingdings" w:hint="default"/>
+        <w:sz w:val="20"/>
+      </w:rPr>
+    </w:lvl>
+    <w:lvl w:ilvl="8" w:tentative="1">
+      <w:start w:val="1"/>
+      <w:numFmt w:val="bullet"/>
+      <w:lvlText w:val=""/>
+      <w:lvlJc w:val="left"/>
+      <w:pPr>
+        <w:tabs>
+          <w:tab w:val="num" w:pos="6480"/>
+        </w:tabs>
+        <w:ind w:left="6480" w:hanging="360"/>
+      </w:pPr>
+      <w:rPr>
+        <w:rFonts w:ascii="Wingdings" w:hAnsi="Wingdings" w:hint="default"/>
+        <w:sz w:val="20"/>
+      </w:rPr>
+    </w:lvl>
+  </w:abstractNum>
+  <w:abstractNum w:abstractNumId="3" w15:restartNumberingAfterBreak="0">
+    <w:nsid w:val="0D81346B"/>
+    <w:multiLevelType w:val="multilevel"/>
+    <w:tmpl w:val="6B2A86E4"/>
+    <w:lvl w:ilvl="0">
+      <w:start w:val="1"/>
+      <w:numFmt w:val="bullet"/>
+      <w:lvlText w:val=""/>
+      <w:lvlJc w:val="left"/>
+      <w:pPr>
+        <w:tabs>
+          <w:tab w:val="num" w:pos="720"/>
+        </w:tabs>
+        <w:ind w:left="720" w:hanging="360"/>
+      </w:pPr>
+      <w:rPr>
+        <w:rFonts w:ascii="Symbol" w:hAnsi="Symbol" w:hint="default"/>
+        <w:sz w:val="20"/>
+      </w:rPr>
+    </w:lvl>
+    <w:lvl w:ilvl="1" w:tentative="1">
+      <w:start w:val="1"/>
+      <w:numFmt w:val="bullet"/>
+      <w:lvlText w:val="o"/>
+      <w:lvlJc w:val="left"/>
+      <w:pPr>
+        <w:tabs>
+          <w:tab w:val="num" w:pos="1440"/>
+        </w:tabs>
+        <w:ind w:left="1440" w:hanging="360"/>
+      </w:pPr>
+      <w:rPr>
+        <w:rFonts w:ascii="Courier New" w:hAnsi="Courier New" w:hint="default"/>
+        <w:sz w:val="20"/>
+      </w:rPr>
+    </w:lvl>
+    <w:lvl w:ilvl="2" w:tentative="1">
+      <w:start w:val="1"/>
+      <w:numFmt w:val="bullet"/>
+      <w:lvlText w:val=""/>
+      <w:lvlJc w:val="left"/>
+      <w:pPr>
+        <w:tabs>
+          <w:tab w:val="num" w:pos="2160"/>
+        </w:tabs>
+        <w:ind w:left="2160" w:hanging="360"/>
+      </w:pPr>
+      <w:rPr>
+        <w:rFonts w:ascii="Wingdings" w:hAnsi="Wingdings" w:hint="default"/>
+        <w:sz w:val="20"/>
+      </w:rPr>
+    </w:lvl>
+    <w:lvl w:ilvl="3" w:tentative="1">
+      <w:start w:val="1"/>
+      <w:numFmt w:val="bullet"/>
+      <w:lvlText w:val=""/>
+      <w:lvlJc w:val="left"/>
+      <w:pPr>
+        <w:tabs>
+          <w:tab w:val="num" w:pos="2880"/>
+        </w:tabs>
+        <w:ind w:left="2880" w:hanging="360"/>
+      </w:pPr>
+      <w:rPr>
+        <w:rFonts w:ascii="Wingdings" w:hAnsi="Wingdings" w:hint="default"/>
+        <w:sz w:val="20"/>
+      </w:rPr>
+    </w:lvl>
+    <w:lvl w:ilvl="4" w:tentative="1">
+      <w:start w:val="1"/>
+      <w:numFmt w:val="bullet"/>
+      <w:lvlText w:val=""/>
+      <w:lvlJc w:val="left"/>
+      <w:pPr>
+        <w:tabs>
+          <w:tab w:val="num" w:pos="3600"/>
+        </w:tabs>
+        <w:ind w:left="3600" w:hanging="360"/>
+      </w:pPr>
+      <w:rPr>
+        <w:rFonts w:ascii="Wingdings" w:hAnsi="Wingdings" w:hint="default"/>
+        <w:sz w:val="20"/>
+      </w:rPr>
+    </w:lvl>
+    <w:lvl w:ilvl="5" w:tentative="1">
+      <w:start w:val="1"/>
+      <w:numFmt w:val="bullet"/>
+      <w:lvlText w:val=""/>
+      <w:lvlJc w:val="left"/>
+      <w:pPr>
+        <w:tabs>
+          <w:tab w:val="num" w:pos="4320"/>
+        </w:tabs>
+        <w:ind w:left="4320" w:hanging="360"/>
+      </w:pPr>
+      <w:rPr>
+        <w:rFonts w:ascii="Wingdings" w:hAnsi="Wingdings" w:hint="default"/>
+        <w:sz w:val="20"/>
+      </w:rPr>
+    </w:lvl>
+    <w:lvl w:ilvl="6" w:tentative="1">
+      <w:start w:val="1"/>
+      <w:numFmt w:val="bullet"/>
+      <w:lvlText w:val=""/>
+      <w:lvlJc w:val="left"/>
+      <w:pPr>
+        <w:tabs>
+          <w:tab w:val="num" w:pos="5040"/>
+        </w:tabs>
+        <w:ind w:left="5040" w:hanging="360"/>
+      </w:pPr>
+      <w:rPr>
+        <w:rFonts w:ascii="Wingdings" w:hAnsi="Wingdings" w:hint="default"/>
+        <w:sz w:val="20"/>
+      </w:rPr>
+    </w:lvl>
+    <w:lvl w:ilvl="7" w:tentative="1">
+      <w:start w:val="1"/>
+      <w:numFmt w:val="bullet"/>
+      <w:lvlText w:val=""/>
+      <w:lvlJc w:val="left"/>
+      <w:pPr>
+        <w:tabs>
+          <w:tab w:val="num" w:pos="5760"/>
+        </w:tabs>
+        <w:ind w:left="5760" w:hanging="360"/>
+      </w:pPr>
+      <w:rPr>
+        <w:rFonts w:ascii="Wingdings" w:hAnsi="Wingdings" w:hint="default"/>
+        <w:sz w:val="20"/>
+      </w:rPr>
+    </w:lvl>
+    <w:lvl w:ilvl="8" w:tentative="1">
+      <w:start w:val="1"/>
+      <w:numFmt w:val="bullet"/>
+      <w:lvlText w:val=""/>
+      <w:lvlJc w:val="left"/>
+      <w:pPr>
+        <w:tabs>
+          <w:tab w:val="num" w:pos="6480"/>
+        </w:tabs>
+        <w:ind w:left="6480" w:hanging="360"/>
+      </w:pPr>
+      <w:rPr>
+        <w:rFonts w:ascii="Wingdings" w:hAnsi="Wingdings" w:hint="default"/>
+        <w:sz w:val="20"/>
+      </w:rPr>
+    </w:lvl>
+  </w:abstractNum>
+  <w:abstractNum w:abstractNumId="4" w15:restartNumberingAfterBreak="0">
     <w:nsid w:val="0DC44B56"/>
     <w:multiLevelType w:val="multilevel"/>
     <w:tmpl w:val="D3469C3E"/>
@@ -1727,7 +2811,7 @@
       </w:rPr>
     </w:lvl>
   </w:abstractNum>
-  <w:abstractNum w:abstractNumId="3" w15:restartNumberingAfterBreak="0">
+  <w:abstractNum w:abstractNumId="5" w15:restartNumberingAfterBreak="0">
     <w:nsid w:val="10FE02EB"/>
     <w:multiLevelType w:val="multilevel"/>
     <w:tmpl w:val="3D9262CC"/>
@@ -1876,7 +2960,7 @@
       </w:rPr>
     </w:lvl>
   </w:abstractNum>
-  <w:abstractNum w:abstractNumId="4" w15:restartNumberingAfterBreak="0">
+  <w:abstractNum w:abstractNumId="6" w15:restartNumberingAfterBreak="0">
     <w:nsid w:val="11D01974"/>
     <w:multiLevelType w:val="multilevel"/>
     <w:tmpl w:val="48788686"/>
@@ -2025,7 +3109,7 @@
       </w:rPr>
     </w:lvl>
   </w:abstractNum>
-  <w:abstractNum w:abstractNumId="5" w15:restartNumberingAfterBreak="0">
+  <w:abstractNum w:abstractNumId="7" w15:restartNumberingAfterBreak="0">
     <w:nsid w:val="12267284"/>
     <w:multiLevelType w:val="multilevel"/>
     <w:tmpl w:val="EF983CD8"/>
@@ -2174,7 +3258,7 @@
       </w:rPr>
     </w:lvl>
   </w:abstractNum>
-  <w:abstractNum w:abstractNumId="6" w15:restartNumberingAfterBreak="0">
+  <w:abstractNum w:abstractNumId="8" w15:restartNumberingAfterBreak="0">
     <w:nsid w:val="131536BE"/>
     <w:multiLevelType w:val="multilevel"/>
     <w:tmpl w:val="8752FE9E"/>
@@ -2323,7 +3407,7 @@
       </w:rPr>
     </w:lvl>
   </w:abstractNum>
-  <w:abstractNum w:abstractNumId="7" w15:restartNumberingAfterBreak="0">
+  <w:abstractNum w:abstractNumId="9" w15:restartNumberingAfterBreak="0">
     <w:nsid w:val="18617892"/>
     <w:multiLevelType w:val="multilevel"/>
     <w:tmpl w:val="782A817E"/>
@@ -2472,7 +3556,7 @@
       </w:rPr>
     </w:lvl>
   </w:abstractNum>
-  <w:abstractNum w:abstractNumId="8" w15:restartNumberingAfterBreak="0">
+  <w:abstractNum w:abstractNumId="10" w15:restartNumberingAfterBreak="0">
     <w:nsid w:val="205C30DD"/>
     <w:multiLevelType w:val="multilevel"/>
     <w:tmpl w:val="ACB8C1B6"/>
@@ -2621,7 +3705,7 @@
       </w:rPr>
     </w:lvl>
   </w:abstractNum>
-  <w:abstractNum w:abstractNumId="9" w15:restartNumberingAfterBreak="0">
+  <w:abstractNum w:abstractNumId="11" w15:restartNumberingAfterBreak="0">
     <w:nsid w:val="22AF424F"/>
     <w:multiLevelType w:val="multilevel"/>
     <w:tmpl w:val="2B408DFC"/>
@@ -2770,7 +3854,7 @@
       </w:rPr>
     </w:lvl>
   </w:abstractNum>
-  <w:abstractNum w:abstractNumId="10" w15:restartNumberingAfterBreak="0">
+  <w:abstractNum w:abstractNumId="12" w15:restartNumberingAfterBreak="0">
     <w:nsid w:val="246D26F0"/>
     <w:multiLevelType w:val="multilevel"/>
     <w:tmpl w:val="FBD0163C"/>
@@ -2919,7 +4003,305 @@
       </w:rPr>
     </w:lvl>
   </w:abstractNum>
-  <w:abstractNum w:abstractNumId="11" w15:restartNumberingAfterBreak="0">
+  <w:abstractNum w:abstractNumId="13" w15:restartNumberingAfterBreak="0">
+    <w:nsid w:val="2EAD622B"/>
+    <w:multiLevelType w:val="multilevel"/>
+    <w:tmpl w:val="C61E0528"/>
+    <w:lvl w:ilvl="0">
+      <w:start w:val="1"/>
+      <w:numFmt w:val="bullet"/>
+      <w:lvlText w:val=""/>
+      <w:lvlJc w:val="left"/>
+      <w:pPr>
+        <w:tabs>
+          <w:tab w:val="num" w:pos="720"/>
+        </w:tabs>
+        <w:ind w:left="720" w:hanging="360"/>
+      </w:pPr>
+      <w:rPr>
+        <w:rFonts w:ascii="Symbol" w:hAnsi="Symbol" w:hint="default"/>
+        <w:sz w:val="20"/>
+      </w:rPr>
+    </w:lvl>
+    <w:lvl w:ilvl="1" w:tentative="1">
+      <w:start w:val="1"/>
+      <w:numFmt w:val="bullet"/>
+      <w:lvlText w:val="o"/>
+      <w:lvlJc w:val="left"/>
+      <w:pPr>
+        <w:tabs>
+          <w:tab w:val="num" w:pos="1440"/>
+        </w:tabs>
+        <w:ind w:left="1440" w:hanging="360"/>
+      </w:pPr>
+      <w:rPr>
+        <w:rFonts w:ascii="Courier New" w:hAnsi="Courier New" w:hint="default"/>
+        <w:sz w:val="20"/>
+      </w:rPr>
+    </w:lvl>
+    <w:lvl w:ilvl="2" w:tentative="1">
+      <w:start w:val="1"/>
+      <w:numFmt w:val="bullet"/>
+      <w:lvlText w:val=""/>
+      <w:lvlJc w:val="left"/>
+      <w:pPr>
+        <w:tabs>
+          <w:tab w:val="num" w:pos="2160"/>
+        </w:tabs>
+        <w:ind w:left="2160" w:hanging="360"/>
+      </w:pPr>
+      <w:rPr>
+        <w:rFonts w:ascii="Wingdings" w:hAnsi="Wingdings" w:hint="default"/>
+        <w:sz w:val="20"/>
+      </w:rPr>
+    </w:lvl>
+    <w:lvl w:ilvl="3" w:tentative="1">
+      <w:start w:val="1"/>
+      <w:numFmt w:val="bullet"/>
+      <w:lvlText w:val=""/>
+      <w:lvlJc w:val="left"/>
+      <w:pPr>
+        <w:tabs>
+          <w:tab w:val="num" w:pos="2880"/>
+        </w:tabs>
+        <w:ind w:left="2880" w:hanging="360"/>
+      </w:pPr>
+      <w:rPr>
+        <w:rFonts w:ascii="Wingdings" w:hAnsi="Wingdings" w:hint="default"/>
+        <w:sz w:val="20"/>
+      </w:rPr>
+    </w:lvl>
+    <w:lvl w:ilvl="4" w:tentative="1">
+      <w:start w:val="1"/>
+      <w:numFmt w:val="bullet"/>
+      <w:lvlText w:val=""/>
+      <w:lvlJc w:val="left"/>
+      <w:pPr>
+        <w:tabs>
+          <w:tab w:val="num" w:pos="3600"/>
+        </w:tabs>
+        <w:ind w:left="3600" w:hanging="360"/>
+      </w:pPr>
+      <w:rPr>
+        <w:rFonts w:ascii="Wingdings" w:hAnsi="Wingdings" w:hint="default"/>
+        <w:sz w:val="20"/>
+      </w:rPr>
+    </w:lvl>
+    <w:lvl w:ilvl="5" w:tentative="1">
+      <w:start w:val="1"/>
+      <w:numFmt w:val="bullet"/>
+      <w:lvlText w:val=""/>
+      <w:lvlJc w:val="left"/>
+      <w:pPr>
+        <w:tabs>
+          <w:tab w:val="num" w:pos="4320"/>
+        </w:tabs>
+        <w:ind w:left="4320" w:hanging="360"/>
+      </w:pPr>
+      <w:rPr>
+        <w:rFonts w:ascii="Wingdings" w:hAnsi="Wingdings" w:hint="default"/>
+        <w:sz w:val="20"/>
+      </w:rPr>
+    </w:lvl>
+    <w:lvl w:ilvl="6" w:tentative="1">
+      <w:start w:val="1"/>
+      <w:numFmt w:val="bullet"/>
+      <w:lvlText w:val=""/>
+      <w:lvlJc w:val="left"/>
+      <w:pPr>
+        <w:tabs>
+          <w:tab w:val="num" w:pos="5040"/>
+        </w:tabs>
+        <w:ind w:left="5040" w:hanging="360"/>
+      </w:pPr>
+      <w:rPr>
+        <w:rFonts w:ascii="Wingdings" w:hAnsi="Wingdings" w:hint="default"/>
+        <w:sz w:val="20"/>
+      </w:rPr>
+    </w:lvl>
+    <w:lvl w:ilvl="7" w:tentative="1">
+      <w:start w:val="1"/>
+      <w:numFmt w:val="bullet"/>
+      <w:lvlText w:val=""/>
+      <w:lvlJc w:val="left"/>
+      <w:pPr>
+        <w:tabs>
+          <w:tab w:val="num" w:pos="5760"/>
+        </w:tabs>
+        <w:ind w:left="5760" w:hanging="360"/>
+      </w:pPr>
+      <w:rPr>
+        <w:rFonts w:ascii="Wingdings" w:hAnsi="Wingdings" w:hint="default"/>
+        <w:sz w:val="20"/>
+      </w:rPr>
+    </w:lvl>
+    <w:lvl w:ilvl="8" w:tentative="1">
+      <w:start w:val="1"/>
+      <w:numFmt w:val="bullet"/>
+      <w:lvlText w:val=""/>
+      <w:lvlJc w:val="left"/>
+      <w:pPr>
+        <w:tabs>
+          <w:tab w:val="num" w:pos="6480"/>
+        </w:tabs>
+        <w:ind w:left="6480" w:hanging="360"/>
+      </w:pPr>
+      <w:rPr>
+        <w:rFonts w:ascii="Wingdings" w:hAnsi="Wingdings" w:hint="default"/>
+        <w:sz w:val="20"/>
+      </w:rPr>
+    </w:lvl>
+  </w:abstractNum>
+  <w:abstractNum w:abstractNumId="14" w15:restartNumberingAfterBreak="0">
+    <w:nsid w:val="337A07AA"/>
+    <w:multiLevelType w:val="multilevel"/>
+    <w:tmpl w:val="7BB2EE18"/>
+    <w:lvl w:ilvl="0">
+      <w:start w:val="1"/>
+      <w:numFmt w:val="bullet"/>
+      <w:lvlText w:val=""/>
+      <w:lvlJc w:val="left"/>
+      <w:pPr>
+        <w:tabs>
+          <w:tab w:val="num" w:pos="720"/>
+        </w:tabs>
+        <w:ind w:left="720" w:hanging="360"/>
+      </w:pPr>
+      <w:rPr>
+        <w:rFonts w:ascii="Symbol" w:hAnsi="Symbol" w:hint="default"/>
+        <w:sz w:val="20"/>
+      </w:rPr>
+    </w:lvl>
+    <w:lvl w:ilvl="1" w:tentative="1">
+      <w:start w:val="1"/>
+      <w:numFmt w:val="bullet"/>
+      <w:lvlText w:val="o"/>
+      <w:lvlJc w:val="left"/>
+      <w:pPr>
+        <w:tabs>
+          <w:tab w:val="num" w:pos="1440"/>
+        </w:tabs>
+        <w:ind w:left="1440" w:hanging="360"/>
+      </w:pPr>
+      <w:rPr>
+        <w:rFonts w:ascii="Courier New" w:hAnsi="Courier New" w:hint="default"/>
+        <w:sz w:val="20"/>
+      </w:rPr>
+    </w:lvl>
+    <w:lvl w:ilvl="2" w:tentative="1">
+      <w:start w:val="1"/>
+      <w:numFmt w:val="bullet"/>
+      <w:lvlText w:val=""/>
+      <w:lvlJc w:val="left"/>
+      <w:pPr>
+        <w:tabs>
+          <w:tab w:val="num" w:pos="2160"/>
+        </w:tabs>
+        <w:ind w:left="2160" w:hanging="360"/>
+      </w:pPr>
+      <w:rPr>
+        <w:rFonts w:ascii="Wingdings" w:hAnsi="Wingdings" w:hint="default"/>
+        <w:sz w:val="20"/>
+      </w:rPr>
+    </w:lvl>
+    <w:lvl w:ilvl="3" w:tentative="1">
+      <w:start w:val="1"/>
+      <w:numFmt w:val="bullet"/>
+      <w:lvlText w:val=""/>
+      <w:lvlJc w:val="left"/>
+      <w:pPr>
+        <w:tabs>
+          <w:tab w:val="num" w:pos="2880"/>
+        </w:tabs>
+        <w:ind w:left="2880" w:hanging="360"/>
+      </w:pPr>
+      <w:rPr>
+        <w:rFonts w:ascii="Wingdings" w:hAnsi="Wingdings" w:hint="default"/>
+        <w:sz w:val="20"/>
+      </w:rPr>
+    </w:lvl>
+    <w:lvl w:ilvl="4" w:tentative="1">
+      <w:start w:val="1"/>
+      <w:numFmt w:val="bullet"/>
+      <w:lvlText w:val=""/>
+      <w:lvlJc w:val="left"/>
+      <w:pPr>
+        <w:tabs>
+          <w:tab w:val="num" w:pos="3600"/>
+        </w:tabs>
+        <w:ind w:left="3600" w:hanging="360"/>
+      </w:pPr>
+      <w:rPr>
+        <w:rFonts w:ascii="Wingdings" w:hAnsi="Wingdings" w:hint="default"/>
+        <w:sz w:val="20"/>
+      </w:rPr>
+    </w:lvl>
+    <w:lvl w:ilvl="5" w:tentative="1">
+      <w:start w:val="1"/>
+      <w:numFmt w:val="bullet"/>
+      <w:lvlText w:val=""/>
+      <w:lvlJc w:val="left"/>
+      <w:pPr>
+        <w:tabs>
+          <w:tab w:val="num" w:pos="4320"/>
+        </w:tabs>
+        <w:ind w:left="4320" w:hanging="360"/>
+      </w:pPr>
+      <w:rPr>
+        <w:rFonts w:ascii="Wingdings" w:hAnsi="Wingdings" w:hint="default"/>
+        <w:sz w:val="20"/>
+      </w:rPr>
+    </w:lvl>
+    <w:lvl w:ilvl="6" w:tentative="1">
+      <w:start w:val="1"/>
+      <w:numFmt w:val="bullet"/>
+      <w:lvlText w:val=""/>
+      <w:lvlJc w:val="left"/>
+      <w:pPr>
+        <w:tabs>
+          <w:tab w:val="num" w:pos="5040"/>
+        </w:tabs>
+        <w:ind w:left="5040" w:hanging="360"/>
+      </w:pPr>
+      <w:rPr>
+        <w:rFonts w:ascii="Wingdings" w:hAnsi="Wingdings" w:hint="default"/>
+        <w:sz w:val="20"/>
+      </w:rPr>
+    </w:lvl>
+    <w:lvl w:ilvl="7" w:tentative="1">
+      <w:start w:val="1"/>
+      <w:numFmt w:val="bullet"/>
+      <w:lvlText w:val=""/>
+      <w:lvlJc w:val="left"/>
+      <w:pPr>
+        <w:tabs>
+          <w:tab w:val="num" w:pos="5760"/>
+        </w:tabs>
+        <w:ind w:left="5760" w:hanging="360"/>
+      </w:pPr>
+      <w:rPr>
+        <w:rFonts w:ascii="Wingdings" w:hAnsi="Wingdings" w:hint="default"/>
+        <w:sz w:val="20"/>
+      </w:rPr>
+    </w:lvl>
+    <w:lvl w:ilvl="8" w:tentative="1">
+      <w:start w:val="1"/>
+      <w:numFmt w:val="bullet"/>
+      <w:lvlText w:val=""/>
+      <w:lvlJc w:val="left"/>
+      <w:pPr>
+        <w:tabs>
+          <w:tab w:val="num" w:pos="6480"/>
+        </w:tabs>
+        <w:ind w:left="6480" w:hanging="360"/>
+      </w:pPr>
+      <w:rPr>
+        <w:rFonts w:ascii="Wingdings" w:hAnsi="Wingdings" w:hint="default"/>
+        <w:sz w:val="20"/>
+      </w:rPr>
+    </w:lvl>
+  </w:abstractNum>
+  <w:abstractNum w:abstractNumId="15" w15:restartNumberingAfterBreak="0">
     <w:nsid w:val="356B1473"/>
     <w:multiLevelType w:val="multilevel"/>
     <w:tmpl w:val="45B0F8E6"/>
@@ -3068,7 +4450,7 @@
       </w:rPr>
     </w:lvl>
   </w:abstractNum>
-  <w:abstractNum w:abstractNumId="12" w15:restartNumberingAfterBreak="0">
+  <w:abstractNum w:abstractNumId="16" w15:restartNumberingAfterBreak="0">
     <w:nsid w:val="3D300A50"/>
     <w:multiLevelType w:val="multilevel"/>
     <w:tmpl w:val="BA2800D6"/>
@@ -3217,7 +4599,7 @@
       </w:rPr>
     </w:lvl>
   </w:abstractNum>
-  <w:abstractNum w:abstractNumId="13" w15:restartNumberingAfterBreak="0">
+  <w:abstractNum w:abstractNumId="17" w15:restartNumberingAfterBreak="0">
     <w:nsid w:val="442D3477"/>
     <w:multiLevelType w:val="multilevel"/>
     <w:tmpl w:val="111CB850"/>
@@ -3366,7 +4748,7 @@
       </w:rPr>
     </w:lvl>
   </w:abstractNum>
-  <w:abstractNum w:abstractNumId="14" w15:restartNumberingAfterBreak="0">
+  <w:abstractNum w:abstractNumId="18" w15:restartNumberingAfterBreak="0">
     <w:nsid w:val="44715A73"/>
     <w:multiLevelType w:val="multilevel"/>
     <w:tmpl w:val="519C20A2"/>
@@ -3515,7 +4897,7 @@
       </w:rPr>
     </w:lvl>
   </w:abstractNum>
-  <w:abstractNum w:abstractNumId="15" w15:restartNumberingAfterBreak="0">
+  <w:abstractNum w:abstractNumId="19" w15:restartNumberingAfterBreak="0">
     <w:nsid w:val="46FC07DC"/>
     <w:multiLevelType w:val="multilevel"/>
     <w:tmpl w:val="6EEE4144"/>
@@ -3664,7 +5046,7 @@
       </w:rPr>
     </w:lvl>
   </w:abstractNum>
-  <w:abstractNum w:abstractNumId="16" w15:restartNumberingAfterBreak="0">
+  <w:abstractNum w:abstractNumId="20" w15:restartNumberingAfterBreak="0">
     <w:nsid w:val="4EA55AC0"/>
     <w:multiLevelType w:val="multilevel"/>
     <w:tmpl w:val="890289A4"/>
@@ -3813,7 +5195,7 @@
       </w:rPr>
     </w:lvl>
   </w:abstractNum>
-  <w:abstractNum w:abstractNumId="17" w15:restartNumberingAfterBreak="0">
+  <w:abstractNum w:abstractNumId="21" w15:restartNumberingAfterBreak="0">
     <w:nsid w:val="50EA6183"/>
     <w:multiLevelType w:val="multilevel"/>
     <w:tmpl w:val="64385654"/>
@@ -3962,7 +5344,156 @@
       </w:rPr>
     </w:lvl>
   </w:abstractNum>
-  <w:abstractNum w:abstractNumId="18" w15:restartNumberingAfterBreak="0">
+  <w:abstractNum w:abstractNumId="22" w15:restartNumberingAfterBreak="0">
+    <w:nsid w:val="538E4660"/>
+    <w:multiLevelType w:val="multilevel"/>
+    <w:tmpl w:val="48F65D64"/>
+    <w:lvl w:ilvl="0">
+      <w:start w:val="1"/>
+      <w:numFmt w:val="bullet"/>
+      <w:lvlText w:val=""/>
+      <w:lvlJc w:val="left"/>
+      <w:pPr>
+        <w:tabs>
+          <w:tab w:val="num" w:pos="720"/>
+        </w:tabs>
+        <w:ind w:left="720" w:hanging="360"/>
+      </w:pPr>
+      <w:rPr>
+        <w:rFonts w:ascii="Symbol" w:hAnsi="Symbol" w:hint="default"/>
+        <w:sz w:val="20"/>
+      </w:rPr>
+    </w:lvl>
+    <w:lvl w:ilvl="1" w:tentative="1">
+      <w:start w:val="1"/>
+      <w:numFmt w:val="bullet"/>
+      <w:lvlText w:val="o"/>
+      <w:lvlJc w:val="left"/>
+      <w:pPr>
+        <w:tabs>
+          <w:tab w:val="num" w:pos="1440"/>
+        </w:tabs>
+        <w:ind w:left="1440" w:hanging="360"/>
+      </w:pPr>
+      <w:rPr>
+        <w:rFonts w:ascii="Courier New" w:hAnsi="Courier New" w:hint="default"/>
+        <w:sz w:val="20"/>
+      </w:rPr>
+    </w:lvl>
+    <w:lvl w:ilvl="2" w:tentative="1">
+      <w:start w:val="1"/>
+      <w:numFmt w:val="bullet"/>
+      <w:lvlText w:val=""/>
+      <w:lvlJc w:val="left"/>
+      <w:pPr>
+        <w:tabs>
+          <w:tab w:val="num" w:pos="2160"/>
+        </w:tabs>
+        <w:ind w:left="2160" w:hanging="360"/>
+      </w:pPr>
+      <w:rPr>
+        <w:rFonts w:ascii="Wingdings" w:hAnsi="Wingdings" w:hint="default"/>
+        <w:sz w:val="20"/>
+      </w:rPr>
+    </w:lvl>
+    <w:lvl w:ilvl="3" w:tentative="1">
+      <w:start w:val="1"/>
+      <w:numFmt w:val="bullet"/>
+      <w:lvlText w:val=""/>
+      <w:lvlJc w:val="left"/>
+      <w:pPr>
+        <w:tabs>
+          <w:tab w:val="num" w:pos="2880"/>
+        </w:tabs>
+        <w:ind w:left="2880" w:hanging="360"/>
+      </w:pPr>
+      <w:rPr>
+        <w:rFonts w:ascii="Wingdings" w:hAnsi="Wingdings" w:hint="default"/>
+        <w:sz w:val="20"/>
+      </w:rPr>
+    </w:lvl>
+    <w:lvl w:ilvl="4" w:tentative="1">
+      <w:start w:val="1"/>
+      <w:numFmt w:val="bullet"/>
+      <w:lvlText w:val=""/>
+      <w:lvlJc w:val="left"/>
+      <w:pPr>
+        <w:tabs>
+          <w:tab w:val="num" w:pos="3600"/>
+        </w:tabs>
+        <w:ind w:left="3600" w:hanging="360"/>
+      </w:pPr>
+      <w:rPr>
+        <w:rFonts w:ascii="Wingdings" w:hAnsi="Wingdings" w:hint="default"/>
+        <w:sz w:val="20"/>
+      </w:rPr>
+    </w:lvl>
+    <w:lvl w:ilvl="5" w:tentative="1">
+      <w:start w:val="1"/>
+      <w:numFmt w:val="bullet"/>
+      <w:lvlText w:val=""/>
+      <w:lvlJc w:val="left"/>
+      <w:pPr>
+        <w:tabs>
+          <w:tab w:val="num" w:pos="4320"/>
+        </w:tabs>
+        <w:ind w:left="4320" w:hanging="360"/>
+      </w:pPr>
+      <w:rPr>
+        <w:rFonts w:ascii="Wingdings" w:hAnsi="Wingdings" w:hint="default"/>
+        <w:sz w:val="20"/>
+      </w:rPr>
+    </w:lvl>
+    <w:lvl w:ilvl="6" w:tentative="1">
+      <w:start w:val="1"/>
+      <w:numFmt w:val="bullet"/>
+      <w:lvlText w:val=""/>
+      <w:lvlJc w:val="left"/>
+      <w:pPr>
+        <w:tabs>
+          <w:tab w:val="num" w:pos="5040"/>
+        </w:tabs>
+        <w:ind w:left="5040" w:hanging="360"/>
+      </w:pPr>
+      <w:rPr>
+        <w:rFonts w:ascii="Wingdings" w:hAnsi="Wingdings" w:hint="default"/>
+        <w:sz w:val="20"/>
+      </w:rPr>
+    </w:lvl>
+    <w:lvl w:ilvl="7" w:tentative="1">
+      <w:start w:val="1"/>
+      <w:numFmt w:val="bullet"/>
+      <w:lvlText w:val=""/>
+      <w:lvlJc w:val="left"/>
+      <w:pPr>
+        <w:tabs>
+          <w:tab w:val="num" w:pos="5760"/>
+        </w:tabs>
+        <w:ind w:left="5760" w:hanging="360"/>
+      </w:pPr>
+      <w:rPr>
+        <w:rFonts w:ascii="Wingdings" w:hAnsi="Wingdings" w:hint="default"/>
+        <w:sz w:val="20"/>
+      </w:rPr>
+    </w:lvl>
+    <w:lvl w:ilvl="8" w:tentative="1">
+      <w:start w:val="1"/>
+      <w:numFmt w:val="bullet"/>
+      <w:lvlText w:val=""/>
+      <w:lvlJc w:val="left"/>
+      <w:pPr>
+        <w:tabs>
+          <w:tab w:val="num" w:pos="6480"/>
+        </w:tabs>
+        <w:ind w:left="6480" w:hanging="360"/>
+      </w:pPr>
+      <w:rPr>
+        <w:rFonts w:ascii="Wingdings" w:hAnsi="Wingdings" w:hint="default"/>
+        <w:sz w:val="20"/>
+      </w:rPr>
+    </w:lvl>
+  </w:abstractNum>
+  <w:abstractNum w:abstractNumId="23" w15:restartNumberingAfterBreak="0">
     <w:nsid w:val="568D15EB"/>
     <w:multiLevelType w:val="multilevel"/>
     <w:tmpl w:val="1C7E5050"/>
@@ -4111,7 +5642,7 @@
       </w:rPr>
     </w:lvl>
   </w:abstractNum>
-  <w:abstractNum w:abstractNumId="19" w15:restartNumberingAfterBreak="0">
+  <w:abstractNum w:abstractNumId="24" w15:restartNumberingAfterBreak="0">
     <w:nsid w:val="59EF774A"/>
     <w:multiLevelType w:val="multilevel"/>
     <w:tmpl w:val="4DF060BE"/>
@@ -4260,7 +5791,7 @@
       </w:rPr>
     </w:lvl>
   </w:abstractNum>
-  <w:abstractNum w:abstractNumId="20" w15:restartNumberingAfterBreak="0">
+  <w:abstractNum w:abstractNumId="25" w15:restartNumberingAfterBreak="0">
     <w:nsid w:val="673A74FC"/>
     <w:multiLevelType w:val="multilevel"/>
     <w:tmpl w:val="4D589116"/>
@@ -4409,7 +5940,156 @@
       </w:rPr>
     </w:lvl>
   </w:abstractNum>
-  <w:abstractNum w:abstractNumId="21" w15:restartNumberingAfterBreak="0">
+  <w:abstractNum w:abstractNumId="26" w15:restartNumberingAfterBreak="0">
+    <w:nsid w:val="6F416098"/>
+    <w:multiLevelType w:val="multilevel"/>
+    <w:tmpl w:val="C3B44632"/>
+    <w:lvl w:ilvl="0">
+      <w:start w:val="1"/>
+      <w:numFmt w:val="bullet"/>
+      <w:lvlText w:val=""/>
+      <w:lvlJc w:val="left"/>
+      <w:pPr>
+        <w:tabs>
+          <w:tab w:val="num" w:pos="720"/>
+        </w:tabs>
+        <w:ind w:left="720" w:hanging="360"/>
+      </w:pPr>
+      <w:rPr>
+        <w:rFonts w:ascii="Symbol" w:hAnsi="Symbol" w:hint="default"/>
+        <w:sz w:val="20"/>
+      </w:rPr>
+    </w:lvl>
+    <w:lvl w:ilvl="1" w:tentative="1">
+      <w:start w:val="1"/>
+      <w:numFmt w:val="bullet"/>
+      <w:lvlText w:val="o"/>
+      <w:lvlJc w:val="left"/>
+      <w:pPr>
+        <w:tabs>
+          <w:tab w:val="num" w:pos="1440"/>
+        </w:tabs>
+        <w:ind w:left="1440" w:hanging="360"/>
+      </w:pPr>
+      <w:rPr>
+        <w:rFonts w:ascii="Courier New" w:hAnsi="Courier New" w:hint="default"/>
+        <w:sz w:val="20"/>
+      </w:rPr>
+    </w:lvl>
+    <w:lvl w:ilvl="2" w:tentative="1">
+      <w:start w:val="1"/>
+      <w:numFmt w:val="bullet"/>
+      <w:lvlText w:val=""/>
+      <w:lvlJc w:val="left"/>
+      <w:pPr>
+        <w:tabs>
+          <w:tab w:val="num" w:pos="2160"/>
+        </w:tabs>
+        <w:ind w:left="2160" w:hanging="360"/>
+      </w:pPr>
+      <w:rPr>
+        <w:rFonts w:ascii="Wingdings" w:hAnsi="Wingdings" w:hint="default"/>
+        <w:sz w:val="20"/>
+      </w:rPr>
+    </w:lvl>
+    <w:lvl w:ilvl="3" w:tentative="1">
+      <w:start w:val="1"/>
+      <w:numFmt w:val="bullet"/>
+      <w:lvlText w:val=""/>
+      <w:lvlJc w:val="left"/>
+      <w:pPr>
+        <w:tabs>
+          <w:tab w:val="num" w:pos="2880"/>
+        </w:tabs>
+        <w:ind w:left="2880" w:hanging="360"/>
+      </w:pPr>
+      <w:rPr>
+        <w:rFonts w:ascii="Wingdings" w:hAnsi="Wingdings" w:hint="default"/>
+        <w:sz w:val="20"/>
+      </w:rPr>
+    </w:lvl>
+    <w:lvl w:ilvl="4" w:tentative="1">
+      <w:start w:val="1"/>
+      <w:numFmt w:val="bullet"/>
+      <w:lvlText w:val=""/>
+      <w:lvlJc w:val="left"/>
+      <w:pPr>
+        <w:tabs>
+          <w:tab w:val="num" w:pos="3600"/>
+        </w:tabs>
+        <w:ind w:left="3600" w:hanging="360"/>
+      </w:pPr>
+      <w:rPr>
+        <w:rFonts w:ascii="Wingdings" w:hAnsi="Wingdings" w:hint="default"/>
+        <w:sz w:val="20"/>
+      </w:rPr>
+    </w:lvl>
+    <w:lvl w:ilvl="5" w:tentative="1">
+      <w:start w:val="1"/>
+      <w:numFmt w:val="bullet"/>
+      <w:lvlText w:val=""/>
+      <w:lvlJc w:val="left"/>
+      <w:pPr>
+        <w:tabs>
+          <w:tab w:val="num" w:pos="4320"/>
+        </w:tabs>
+        <w:ind w:left="4320" w:hanging="360"/>
+      </w:pPr>
+      <w:rPr>
+        <w:rFonts w:ascii="Wingdings" w:hAnsi="Wingdings" w:hint="default"/>
+        <w:sz w:val="20"/>
+      </w:rPr>
+    </w:lvl>
+    <w:lvl w:ilvl="6" w:tentative="1">
+      <w:start w:val="1"/>
+      <w:numFmt w:val="bullet"/>
+      <w:lvlText w:val=""/>
+      <w:lvlJc w:val="left"/>
+      <w:pPr>
+        <w:tabs>
+          <w:tab w:val="num" w:pos="5040"/>
+        </w:tabs>
+        <w:ind w:left="5040" w:hanging="360"/>
+      </w:pPr>
+      <w:rPr>
+        <w:rFonts w:ascii="Wingdings" w:hAnsi="Wingdings" w:hint="default"/>
+        <w:sz w:val="20"/>
+      </w:rPr>
+    </w:lvl>
+    <w:lvl w:ilvl="7" w:tentative="1">
+      <w:start w:val="1"/>
+      <w:numFmt w:val="bullet"/>
+      <w:lvlText w:val=""/>
+      <w:lvlJc w:val="left"/>
+      <w:pPr>
+        <w:tabs>
+          <w:tab w:val="num" w:pos="5760"/>
+        </w:tabs>
+        <w:ind w:left="5760" w:hanging="360"/>
+      </w:pPr>
+      <w:rPr>
+        <w:rFonts w:ascii="Wingdings" w:hAnsi="Wingdings" w:hint="default"/>
+        <w:sz w:val="20"/>
+      </w:rPr>
+    </w:lvl>
+    <w:lvl w:ilvl="8" w:tentative="1">
+      <w:start w:val="1"/>
+      <w:numFmt w:val="bullet"/>
+      <w:lvlText w:val=""/>
+      <w:lvlJc w:val="left"/>
+      <w:pPr>
+        <w:tabs>
+          <w:tab w:val="num" w:pos="6480"/>
+        </w:tabs>
+        <w:ind w:left="6480" w:hanging="360"/>
+      </w:pPr>
+      <w:rPr>
+        <w:rFonts w:ascii="Wingdings" w:hAnsi="Wingdings" w:hint="default"/>
+        <w:sz w:val="20"/>
+      </w:rPr>
+    </w:lvl>
+  </w:abstractNum>
+  <w:abstractNum w:abstractNumId="27" w15:restartNumberingAfterBreak="0">
     <w:nsid w:val="7EAE3D6C"/>
     <w:multiLevelType w:val="multilevel"/>
     <w:tmpl w:val="2612D4CA"/>
@@ -4559,70 +6239,88 @@
     </w:lvl>
   </w:abstractNum>
   <w:num w:numId="1" w16cid:durableId="1524858406">
-    <w:abstractNumId w:val="6"/>
+    <w:abstractNumId w:val="8"/>
   </w:num>
   <w:num w:numId="2" w16cid:durableId="670334287">
+    <w:abstractNumId w:val="19"/>
+  </w:num>
+  <w:num w:numId="3" w16cid:durableId="1185705925">
+    <w:abstractNumId w:val="4"/>
+  </w:num>
+  <w:num w:numId="4" w16cid:durableId="574972014">
     <w:abstractNumId w:val="15"/>
   </w:num>
-  <w:num w:numId="3" w16cid:durableId="1185705925">
-    <w:abstractNumId w:val="2"/>
-  </w:num>
-  <w:num w:numId="4" w16cid:durableId="574972014">
-    <w:abstractNumId w:val="11"/>
-  </w:num>
   <w:num w:numId="5" w16cid:durableId="771634976">
-    <w:abstractNumId w:val="10"/>
+    <w:abstractNumId w:val="12"/>
   </w:num>
   <w:num w:numId="6" w16cid:durableId="1115559171">
     <w:abstractNumId w:val="0"/>
   </w:num>
   <w:num w:numId="7" w16cid:durableId="435028194">
-    <w:abstractNumId w:val="17"/>
+    <w:abstractNumId w:val="21"/>
   </w:num>
   <w:num w:numId="8" w16cid:durableId="192697529">
     <w:abstractNumId w:val="1"/>
   </w:num>
   <w:num w:numId="9" w16cid:durableId="812717888">
-    <w:abstractNumId w:val="4"/>
+    <w:abstractNumId w:val="6"/>
   </w:num>
   <w:num w:numId="10" w16cid:durableId="489252367">
+    <w:abstractNumId w:val="9"/>
+  </w:num>
+  <w:num w:numId="11" w16cid:durableId="1180507767">
+    <w:abstractNumId w:val="5"/>
+  </w:num>
+  <w:num w:numId="12" w16cid:durableId="2063404755">
+    <w:abstractNumId w:val="27"/>
+  </w:num>
+  <w:num w:numId="13" w16cid:durableId="996614508">
+    <w:abstractNumId w:val="23"/>
+  </w:num>
+  <w:num w:numId="14" w16cid:durableId="1963683561">
+    <w:abstractNumId w:val="24"/>
+  </w:num>
+  <w:num w:numId="15" w16cid:durableId="1838181925">
+    <w:abstractNumId w:val="10"/>
+  </w:num>
+  <w:num w:numId="16" w16cid:durableId="462310502">
+    <w:abstractNumId w:val="18"/>
+  </w:num>
+  <w:num w:numId="17" w16cid:durableId="947078150">
+    <w:abstractNumId w:val="11"/>
+  </w:num>
+  <w:num w:numId="18" w16cid:durableId="907233361">
+    <w:abstractNumId w:val="25"/>
+  </w:num>
+  <w:num w:numId="19" w16cid:durableId="1465464022">
     <w:abstractNumId w:val="7"/>
   </w:num>
-  <w:num w:numId="11" w16cid:durableId="1180507767">
+  <w:num w:numId="20" w16cid:durableId="1094479370">
+    <w:abstractNumId w:val="17"/>
+  </w:num>
+  <w:num w:numId="21" w16cid:durableId="953052919">
+    <w:abstractNumId w:val="16"/>
+  </w:num>
+  <w:num w:numId="22" w16cid:durableId="1642803525">
+    <w:abstractNumId w:val="20"/>
+  </w:num>
+  <w:num w:numId="23" w16cid:durableId="534118484">
+    <w:abstractNumId w:val="22"/>
+  </w:num>
+  <w:num w:numId="24" w16cid:durableId="1788310699">
+    <w:abstractNumId w:val="14"/>
+  </w:num>
+  <w:num w:numId="25" w16cid:durableId="905066850">
     <w:abstractNumId w:val="3"/>
   </w:num>
-  <w:num w:numId="12" w16cid:durableId="2063404755">
-    <w:abstractNumId w:val="21"/>
-  </w:num>
-  <w:num w:numId="13" w16cid:durableId="996614508">
-    <w:abstractNumId w:val="18"/>
-  </w:num>
-  <w:num w:numId="14" w16cid:durableId="1963683561">
-    <w:abstractNumId w:val="19"/>
-  </w:num>
-  <w:num w:numId="15" w16cid:durableId="1838181925">
-    <w:abstractNumId w:val="8"/>
-  </w:num>
-  <w:num w:numId="16" w16cid:durableId="462310502">
-    <w:abstractNumId w:val="14"/>
-  </w:num>
-  <w:num w:numId="17" w16cid:durableId="947078150">
-    <w:abstractNumId w:val="9"/>
-  </w:num>
-  <w:num w:numId="18" w16cid:durableId="907233361">
-    <w:abstractNumId w:val="20"/>
-  </w:num>
-  <w:num w:numId="19" w16cid:durableId="1465464022">
-    <w:abstractNumId w:val="5"/>
-  </w:num>
-  <w:num w:numId="20" w16cid:durableId="1094479370">
+  <w:num w:numId="26" w16cid:durableId="123282147">
     <w:abstractNumId w:val="13"/>
   </w:num>
-  <w:num w:numId="21" w16cid:durableId="953052919">
-    <w:abstractNumId w:val="12"/>
+  <w:num w:numId="27" w16cid:durableId="1618560954">
+    <w:abstractNumId w:val="2"/>
   </w:num>
-  <w:num w:numId="22" w16cid:durableId="1642803525">
-    <w:abstractNumId w:val="16"/>
+  <w:num w:numId="28" w16cid:durableId="614137912">
+    <w:abstractNumId w:val="26"/>
   </w:num>
 </w:numbering>
 </file>

</xml_diff>